<commit_message>
Report: first-principles 80/20 rewrite for interpretability
- Add a "Reading the numbers" callout box at the very top: the pts->steals rule
  ("+5 pts ≈ 1 extra steal / 20 tries") is now the first thing the reader sees,
  before any number — no more hunting for what "pts" means.
- Add an 80/20 headline strip up front: the three coachable levers ranked by
  steal payoff (+5 / +3 / +2 steals per 20), so the punchline lands immediately.
- Move the full metric glossary off page 1 to a "Metric Reference" at the back
  (dig-deeper layer) — page 1 is now a clean hook, not a wall of definitions.
- callout_box() helper for the shaded titled boxes.
</commit_message>
<xml_diff>
--- a/Naylor_Model_v8_Report.docx
+++ b/Naylor_Model_v8_Report.docx
@@ -59,14 +59,6 @@
         <w:t>The model is named for the clearest living example of one quality — a runner who steals better than ~99% of the league despite bottom-of-the-league speed. In 2025 Josh Naylor stole 30 bases at 92% while running slower than 98% of MLB: the #1 steal-skill season in our data of 673. But this is not a report about one player. It is about the quality he exemplifies — a quick jump, an explosive secondary lead, and reading the pitcher early — which shows up all over the league and, unlike foot speed, is coachable. The next four pages give you (1) the equation for what each skill is worth, (2) the runners who already have it, (3) a 2025 target board of who to develop and the projected prize, and (4) the three drills that move the needle most.</w:t>
       </w:r>
     </w:p>
-    <w:p>
-      <w:pPr>
-        <w:pStyle w:val="Heading2"/>
-      </w:pPr>
-      <w:r>
-        <w:t>What the metrics mean (everything you need — no other pages required)</w:t>
-      </w:r>
-    </w:p>
     <w:tbl>
       <w:tblPr>
         <w:tblStyle w:val="TableGrid"/>
@@ -75,14 +67,13 @@
         <w:tblLook w:firstColumn="1" w:firstRow="1" w:lastColumn="0" w:lastRow="0" w:noHBand="0" w:noVBand="1" w:val="04A0"/>
       </w:tblPr>
       <w:tblGrid>
-        <w:gridCol w:w="5112"/>
-        <w:gridCol w:w="5112"/>
+        <w:gridCol w:w="10224"/>
       </w:tblGrid>
       <w:tr>
         <w:tc>
           <w:tcPr>
-            <w:tcW w:type="dxa" w:w="2736"/>
-            <w:shd w:val="clear" w:color="auto" w:fill="EAF1F7"/>
+            <w:tcW w:type="dxa" w:w="10080"/>
+            <w:shd w:val="clear" w:color="auto" w:fill="2C3E50"/>
           </w:tcPr>
           <w:p>
             <w:pPr>
@@ -93,28 +84,10 @@
             <w:r>
               <w:rPr>
                 <w:b/>
-                <w:sz w:val="17"/>
-              </w:rPr>
-              <w:t>Slow-Steal Skill (SSSI)</w:t>
-            </w:r>
-          </w:p>
-        </w:tc>
-        <w:tc>
-          <w:tcPr>
-            <w:tcW w:type="dxa" w:w="7344"/>
-          </w:tcPr>
-          <w:p>
-            <w:pPr>
-              <w:spacing w:after="0" w:before="0"/>
-              <w:jc w:val="left"/>
-            </w:pPr>
-            <w:r/>
-            <w:r>
-              <w:rPr>
-                <w:b w:val="0"/>
-                <w:sz w:val="17"/>
-              </w:rPr>
-              <w:t>Overall technique score — how good a runner is beyond what raw speed explains. Higher = more skill.</w:t>
+                <w:color w:val="FFFFFF"/>
+                <w:sz w:val="21"/>
+              </w:rPr>
+              <w:t>READING THE NUMBERS  ·  the 10-second key</w:t>
             </w:r>
           </w:p>
         </w:tc>
@@ -122,245 +95,65 @@
       <w:tr>
         <w:tc>
           <w:tcPr>
-            <w:tcW w:type="dxa" w:w="2736"/>
-            <w:shd w:val="clear" w:color="auto" w:fill="EAF1F7"/>
-          </w:tcPr>
-          <w:p>
-            <w:pPr>
-              <w:spacing w:after="0" w:before="0"/>
-              <w:jc w:val="left"/>
+            <w:tcW w:type="dxa" w:w="10080"/>
+            <w:shd w:val="clear" w:color="auto" w:fill="F2F7FB"/>
+          </w:tcPr>
+          <w:p>
+            <w:pPr>
+              <w:spacing w:after="40"/>
             </w:pPr>
             <w:r/>
             <w:r>
               <w:rPr>
                 <w:b/>
-                <w:sz w:val="17"/>
-              </w:rPr>
-              <w:t>Top Speed</w:t>
-            </w:r>
-          </w:p>
-        </w:tc>
-        <w:tc>
-          <w:tcPr>
-            <w:tcW w:type="dxa" w:w="7344"/>
-          </w:tcPr>
-          <w:p>
-            <w:pPr>
-              <w:spacing w:after="0" w:before="0"/>
-              <w:jc w:val="left"/>
-            </w:pPr>
-            <w:r/>
-            <w:r>
-              <w:rPr>
-                <w:b w:val="0"/>
-                <w:sz w:val="17"/>
-              </w:rPr>
-              <w:t>Sprint speed in feet/second (Statcast). The structural baseline a runner is born with.</w:t>
-            </w:r>
-          </w:p>
-        </w:tc>
-      </w:tr>
-      <w:tr>
-        <w:tc>
-          <w:tcPr>
-            <w:tcW w:type="dxa" w:w="2736"/>
-            <w:shd w:val="clear" w:color="auto" w:fill="EAF1F7"/>
-          </w:tcPr>
-          <w:p>
-            <w:pPr>
-              <w:spacing w:after="0" w:before="0"/>
-              <w:jc w:val="left"/>
-            </w:pPr>
-            <w:r/>
+                <w:color w:val="2C3E50"/>
+                <w:sz w:val="19"/>
+              </w:rPr>
+              <w:t xml:space="preserve">"pts" = steals.  </w:t>
+            </w:r>
+            <w:r>
+              <w:rPr>
+                <w:sz w:val="19"/>
+              </w:rPr>
+              <w:t>"pts" is the gain in steal-success rate. We never make you do the math — every "pts" is also printed as steals. Rule of thumb: +5 pts ≈ one extra stolen base (and one fewer caught) per 20 tries. So "+25 pts" ≈ +5 steals a season.</w:t>
+            </w:r>
+          </w:p>
+          <w:p>
+            <w:pPr>
+              <w:spacing w:after="40"/>
+            </w:pPr>
             <w:r>
               <w:rPr>
                 <w:b/>
-                <w:sz w:val="17"/>
-              </w:rPr>
-              <w:t>Jump</w:t>
-            </w:r>
-          </w:p>
-        </w:tc>
-        <w:tc>
-          <w:tcPr>
-            <w:tcW w:type="dxa" w:w="7344"/>
-          </w:tcPr>
-          <w:p>
-            <w:pPr>
-              <w:spacing w:after="0" w:before="0"/>
-              <w:jc w:val="left"/>
-            </w:pPr>
-            <w:r/>
-            <w:r>
-              <w:rPr>
-                <w:b w:val="0"/>
-                <w:sz w:val="17"/>
-              </w:rPr>
-              <w:t>Seconds to cover the first 30 ft. Lower = quicker first step. Coachable.</w:t>
-            </w:r>
-          </w:p>
-        </w:tc>
-      </w:tr>
-      <w:tr>
-        <w:tc>
-          <w:tcPr>
-            <w:tcW w:type="dxa" w:w="2736"/>
-            <w:shd w:val="clear" w:color="auto" w:fill="EAF1F7"/>
-          </w:tcPr>
-          <w:p>
-            <w:pPr>
-              <w:spacing w:after="0" w:before="0"/>
-              <w:jc w:val="left"/>
-            </w:pPr>
-            <w:r/>
+                <w:color w:val="2C3E50"/>
+                <w:sz w:val="19"/>
+              </w:rPr>
+              <w:t xml:space="preserve">Colors rank within a table.  </w:t>
+            </w:r>
+            <w:r>
+              <w:rPr>
+                <w:sz w:val="19"/>
+              </w:rPr>
+              <w:t>Green = best of the players shown, red = worst of those shown (can still beat the MLB average), gold = the Naylor/Soto archetype. The charts use no red — every runner shown is already elite.</w:t>
+            </w:r>
+          </w:p>
+          <w:p>
+            <w:pPr>
+              <w:spacing w:after="40"/>
+            </w:pPr>
             <w:r>
               <w:rPr>
                 <w:b/>
-                <w:sz w:val="17"/>
-              </w:rPr>
-              <w:t>First-Step Burst</w:t>
-            </w:r>
-          </w:p>
-        </w:tc>
-        <w:tc>
-          <w:tcPr>
-            <w:tcW w:type="dxa" w:w="7344"/>
-          </w:tcPr>
-          <w:p>
-            <w:pPr>
-              <w:spacing w:after="0" w:before="0"/>
-              <w:jc w:val="left"/>
-            </w:pPr>
-            <w:r/>
-            <w:r>
-              <w:rPr>
-                <w:b w:val="0"/>
-                <w:sz w:val="17"/>
-              </w:rPr>
-              <w:t>Reaches top speed in fewer feet than his speed predicts. A premium when paired with high speed.</w:t>
-            </w:r>
-          </w:p>
-        </w:tc>
-      </w:tr>
-      <w:tr>
-        <w:tc>
-          <w:tcPr>
-            <w:tcW w:type="dxa" w:w="2736"/>
-            <w:shd w:val="clear" w:color="auto" w:fill="EAF1F7"/>
-          </w:tcPr>
-          <w:p>
-            <w:pPr>
-              <w:spacing w:after="0" w:before="0"/>
-              <w:jc w:val="left"/>
-            </w:pPr>
-            <w:r/>
-            <w:r>
-              <w:rPr>
-                <w:b/>
-                <w:sz w:val="17"/>
-              </w:rPr>
-              <w:t>Steals Above Speed-Expected</w:t>
-            </w:r>
-          </w:p>
-        </w:tc>
-        <w:tc>
-          <w:tcPr>
-            <w:tcW w:type="dxa" w:w="7344"/>
-          </w:tcPr>
-          <w:p>
-            <w:pPr>
-              <w:spacing w:after="0" w:before="0"/>
-              <w:jc w:val="left"/>
-            </w:pPr>
-            <w:r/>
-            <w:r>
-              <w:rPr>
-                <w:b w:val="0"/>
-                <w:sz w:val="17"/>
-              </w:rPr>
-              <w:t>Real success rate minus the rate his sprint speed alone would predict. Positive = beats his speed peers.</w:t>
-            </w:r>
-          </w:p>
-        </w:tc>
-      </w:tr>
-      <w:tr>
-        <w:tc>
-          <w:tcPr>
-            <w:tcW w:type="dxa" w:w="2736"/>
-            <w:shd w:val="clear" w:color="auto" w:fill="EAF1F7"/>
-          </w:tcPr>
-          <w:p>
-            <w:pPr>
-              <w:spacing w:after="0" w:before="0"/>
-              <w:jc w:val="left"/>
-            </w:pPr>
-            <w:r/>
-            <w:r>
-              <w:rPr>
-                <w:b/>
-                <w:sz w:val="17"/>
-              </w:rPr>
-              <w:t>Steal Value (xSB)</w:t>
-            </w:r>
-          </w:p>
-        </w:tc>
-        <w:tc>
-          <w:tcPr>
-            <w:tcW w:type="dxa" w:w="7344"/>
-          </w:tcPr>
-          <w:p>
-            <w:pPr>
-              <w:spacing w:after="0" w:before="0"/>
-              <w:jc w:val="left"/>
-            </w:pPr>
-            <w:r/>
-            <w:r>
-              <w:rPr>
-                <w:b w:val="0"/>
-                <w:sz w:val="17"/>
-              </w:rPr>
-              <w:t>Speed AND production combined: z(net steals above avg) + z(top speed). Surfaces fast, high-volume burners.</w:t>
-            </w:r>
-          </w:p>
-        </w:tc>
-      </w:tr>
-      <w:tr>
-        <w:tc>
-          <w:tcPr>
-            <w:tcW w:type="dxa" w:w="2736"/>
-            <w:shd w:val="clear" w:color="auto" w:fill="EAF1F7"/>
-          </w:tcPr>
-          <w:p>
-            <w:pPr>
-              <w:spacing w:after="0" w:before="0"/>
-              <w:jc w:val="left"/>
-            </w:pPr>
-            <w:r/>
-            <w:r>
-              <w:rPr>
-                <w:b/>
-                <w:sz w:val="17"/>
-              </w:rPr>
-              <w:t>Untapped Speed</w:t>
-            </w:r>
-          </w:p>
-        </w:tc>
-        <w:tc>
-          <w:tcPr>
-            <w:tcW w:type="dxa" w:w="7344"/>
-          </w:tcPr>
-          <w:p>
-            <w:pPr>
-              <w:spacing w:after="0" w:before="0"/>
-              <w:jc w:val="left"/>
-            </w:pPr>
-            <w:r/>
-            <w:r>
-              <w:rPr>
-                <w:b w:val="0"/>
-                <w:sz w:val="17"/>
-              </w:rPr>
-              <w:t>Fast but under-stealing — z(top speed) minus z(net steals). The clearest coaching targets.</w:t>
+                <w:color w:val="2C3E50"/>
+                <w:sz w:val="19"/>
+              </w:rPr>
+              <w:t xml:space="preserve">What it's for.  </w:t>
+            </w:r>
+            <w:r>
+              <w:rPr>
+                <w:sz w:val="19"/>
+              </w:rPr>
+              <w:t>Deciding who to develop and what to drill — not predicting any single steal (stealing is high-variance; the model's accuracy is in the Appendix).</w:t>
             </w:r>
           </w:p>
         </w:tc>
@@ -376,119 +169,123 @@
         <w:pStyle w:val="Heading2"/>
       </w:pPr>
       <w:r>
-        <w:t>How to read this report</w:t>
+        <w:t>If you read nothing else: the three levers that move a steal</w:t>
       </w:r>
     </w:p>
+    <w:tbl>
+      <w:tblPr>
+        <w:tblStyle w:val="TableGrid"/>
+        <w:tblW w:type="auto" w:w="0"/>
+        <w:jc w:val="center"/>
+        <w:tblLook w:firstColumn="1" w:firstRow="1" w:lastColumn="0" w:lastRow="0" w:noHBand="0" w:noVBand="1" w:val="04A0"/>
+      </w:tblPr>
+      <w:tblGrid>
+        <w:gridCol w:w="10224"/>
+      </w:tblGrid>
+      <w:tr>
+        <w:tc>
+          <w:tcPr>
+            <w:tcW w:type="dxa" w:w="10080"/>
+            <w:shd w:val="clear" w:color="auto" w:fill="2C3E50"/>
+          </w:tcPr>
+          <w:p>
+            <w:pPr>
+              <w:spacing w:after="0" w:before="0"/>
+              <w:jc w:val="left"/>
+            </w:pPr>
+            <w:r/>
+            <w:r>
+              <w:rPr>
+                <w:b/>
+                <w:color w:val="FFFFFF"/>
+                <w:sz w:val="21"/>
+              </w:rPr>
+              <w:t>The 80/20 — coach these, in order of payoff</w:t>
+            </w:r>
+          </w:p>
+        </w:tc>
+      </w:tr>
+      <w:tr>
+        <w:tc>
+          <w:tcPr>
+            <w:tcW w:type="dxa" w:w="10080"/>
+            <w:shd w:val="clear" w:color="auto" w:fill="F3F8F3"/>
+          </w:tcPr>
+          <w:p>
+            <w:pPr>
+              <w:spacing w:after="40"/>
+            </w:pPr>
+            <w:r/>
+            <w:r>
+              <w:rPr>
+                <w:b/>
+                <w:color w:val="2E7D32"/>
+                <w:sz w:val="19"/>
+              </w:rPr>
+              <w:t xml:space="preserve">≈ +5 steals / 20 tries  </w:t>
+            </w:r>
+            <w:r>
+              <w:rPr>
+                <w:sz w:val="19"/>
+              </w:rPr>
+              <w:t>Ground covered after the pitcher commits  (+25 pts for a +1-step gain).</w:t>
+            </w:r>
+          </w:p>
+          <w:p>
+            <w:pPr>
+              <w:spacing w:after="40"/>
+            </w:pPr>
+            <w:r>
+              <w:rPr>
+                <w:b/>
+                <w:color w:val="2E7D32"/>
+                <w:sz w:val="19"/>
+              </w:rPr>
+              <w:t xml:space="preserve">≈ +3 steals / 20 tries  </w:t>
+            </w:r>
+            <w:r>
+              <w:rPr>
+                <w:sz w:val="19"/>
+              </w:rPr>
+              <w:t>Jump — quickness over the first 30 ft  (+17 pts for a +1-step gain).</w:t>
+            </w:r>
+          </w:p>
+          <w:p>
+            <w:pPr>
+              <w:spacing w:after="40"/>
+            </w:pPr>
+            <w:r>
+              <w:rPr>
+                <w:b/>
+                <w:color w:val="2E7D32"/>
+                <w:sz w:val="19"/>
+              </w:rPr>
+              <w:t xml:space="preserve">≈ +2 steals / 20 tries  </w:t>
+            </w:r>
+            <w:r>
+              <w:rPr>
+                <w:sz w:val="19"/>
+              </w:rPr>
+              <w:t>First-step quickness vs. top speed  (+10 pts for a +1-step gain).</w:t>
+            </w:r>
+          </w:p>
+        </w:tc>
+      </w:tr>
+    </w:tbl>
     <w:p>
       <w:pPr>
         <w:spacing w:after="40"/>
       </w:pPr>
-      <w:r>
-        <w:rPr>
-          <w:color w:val="4CAF5F"/>
-          <w:sz w:val="18"/>
-        </w:rPr>
-        <w:t xml:space="preserve">■ </w:t>
-      </w:r>
-      <w:r>
-        <w:rPr>
-          <w:color w:val="555555"/>
-          <w:sz w:val="17"/>
-        </w:rPr>
-        <w:t>better than peers</w:t>
-      </w:r>
-      <w:r>
-        <w:rPr>
-          <w:color w:val="BFBFBF"/>
-          <w:sz w:val="18"/>
-        </w:rPr>
-        <w:t xml:space="preserve">   ■ </w:t>
-      </w:r>
-      <w:r>
-        <w:rPr>
-          <w:color w:val="555555"/>
-          <w:sz w:val="17"/>
-        </w:rPr>
-        <w:t>league-average</w:t>
-      </w:r>
-      <w:r>
-        <w:rPr>
-          <w:color w:val="D65A4D"/>
-          <w:sz w:val="18"/>
-        </w:rPr>
-        <w:t xml:space="preserve">   ■ </w:t>
-      </w:r>
-      <w:r>
-        <w:rPr>
-          <w:color w:val="555555"/>
-          <w:sz w:val="17"/>
-        </w:rPr>
-        <w:t>worse than peers</w:t>
-      </w:r>
-      <w:r>
-        <w:rPr>
-          <w:i/>
-          <w:color w:val="888888"/>
-          <w:sz w:val="16"/>
-        </w:rPr>
-        <w:t xml:space="preserve">   (shading = standard deviations above/below the players shown)</w:t>
-      </w:r>
     </w:p>
     <w:p>
       <w:pPr>
-        <w:spacing w:after="60"/>
+        <w:spacing w:after="80"/>
       </w:pPr>
-      <w:r>
-        <w:rPr>
-          <w:b/>
-          <w:color w:val="2C3E50"/>
-          <w:sz w:val="19"/>
-        </w:rPr>
-        <w:t xml:space="preserve">Colors are a within-table ranking, not a league verdict.  </w:t>
-      </w:r>
       <w:r>
         <w:rPr>
           <w:sz w:val="19"/>
         </w:rPr>
-        <w:t>Green = a strength, red = a weakness, white = middle — but only versus the other players in that same table. A red cell can still be an above-average MLB number; it just trails the others shown. On the leaderboard figures there is deliberately no red at all: bars are gold for slow runners and blue for fast, because every runner shown is already elite.</w:t>
-      </w:r>
-    </w:p>
-    <w:p>
-      <w:pPr>
-        <w:spacing w:after="60"/>
-      </w:pPr>
-      <w:r>
-        <w:rPr>
-          <w:b/>
-          <w:color w:val="2C3E50"/>
-          <w:sz w:val="19"/>
-        </w:rPr>
-        <w:t xml:space="preserve">"Percentage points" are always translated into steals.  </w:t>
-      </w:r>
-      <w:r>
-        <w:rPr>
-          <w:sz w:val="19"/>
-        </w:rPr>
-        <w:t>A percentage point (pp) is a raw change in success rate — going from 78% to 80% is +2 pp. So you never have to do the math, every pp is also shown as bags: for a runner who tries ~20 steals a season, +5 pp ≈ one extra stolen base and one fewer caught-stealing.</w:t>
-      </w:r>
-    </w:p>
-    <w:p>
-      <w:pPr>
-        <w:spacing w:after="60"/>
-      </w:pPr>
-      <w:r>
-        <w:rPr>
-          <w:b/>
-          <w:color w:val="2C3E50"/>
-          <w:sz w:val="19"/>
-        </w:rPr>
-        <w:t xml:space="preserve">What this model is good at.  </w:t>
-      </w:r>
-      <w:r>
-        <w:rPr>
-          <w:sz w:val="19"/>
-        </w:rPr>
-        <w:t>It is strong at ranking steal skill and telling you which techniques pay off — that is what the equation and the rankings deliver. It is deliberately not a single-pitch oracle: stealing is high-variance, so no model calls individual attempts well (the honest, de-leaked predictive accuracy is in the Technical Appendix). Use it to decide who to develop and what to drill.</w:t>
+        <w:t>All three are technique, not body type — which is why a slow runner can lead the league in steal skill. Section 1 shows the full equation behind these; Section 4 turns them into drills.</w:t>
       </w:r>
     </w:p>
     <w:p>
@@ -8218,6 +8015,329 @@
         <w:t>Catcher pop time and pitcher hold rate move success in the math, but you don't coach them — they're shown so you can separate skill from circumstance.</w:t>
       </w:r>
     </w:p>
+    <w:p>
+      <w:r>
+        <w:br w:type="page"/>
+      </w:r>
+    </w:p>
+    <w:p>
+      <w:pPr>
+        <w:pStyle w:val="Heading1"/>
+      </w:pPr>
+      <w:r>
+        <w:t>Metric Reference — flip here anytime</w:t>
+      </w:r>
+    </w:p>
+    <w:p>
+      <w:pPr>
+        <w:spacing w:after="80"/>
+      </w:pPr>
+      <w:r>
+        <w:rPr>
+          <w:sz w:val="19"/>
+        </w:rPr>
+        <w:t>Plain-English definition of every metric used above. You don't need this to read the report — each section already defines the variables it uses — but it's here if you want to dig into a specific number.</w:t>
+      </w:r>
+    </w:p>
+    <w:tbl>
+      <w:tblPr>
+        <w:tblStyle w:val="TableGrid"/>
+        <w:tblW w:type="auto" w:w="0"/>
+        <w:jc w:val="center"/>
+        <w:tblLook w:firstColumn="1" w:firstRow="1" w:lastColumn="0" w:lastRow="0" w:noHBand="0" w:noVBand="1" w:val="04A0"/>
+      </w:tblPr>
+      <w:tblGrid>
+        <w:gridCol w:w="5112"/>
+        <w:gridCol w:w="5112"/>
+      </w:tblGrid>
+      <w:tr>
+        <w:tc>
+          <w:tcPr>
+            <w:tcW w:type="dxa" w:w="2736"/>
+            <w:shd w:val="clear" w:color="auto" w:fill="EAF1F7"/>
+          </w:tcPr>
+          <w:p>
+            <w:pPr>
+              <w:spacing w:after="0" w:before="0"/>
+              <w:jc w:val="left"/>
+            </w:pPr>
+            <w:r/>
+            <w:r>
+              <w:rPr>
+                <w:b/>
+                <w:sz w:val="17"/>
+              </w:rPr>
+              <w:t>Slow-Steal Skill (SSSI)</w:t>
+            </w:r>
+          </w:p>
+        </w:tc>
+        <w:tc>
+          <w:tcPr>
+            <w:tcW w:type="dxa" w:w="7344"/>
+          </w:tcPr>
+          <w:p>
+            <w:pPr>
+              <w:spacing w:after="0" w:before="0"/>
+              <w:jc w:val="left"/>
+            </w:pPr>
+            <w:r/>
+            <w:r>
+              <w:rPr>
+                <w:b w:val="0"/>
+                <w:sz w:val="17"/>
+              </w:rPr>
+              <w:t>Overall technique score — how good a runner is beyond what raw speed explains. Higher = more skill.</w:t>
+            </w:r>
+          </w:p>
+        </w:tc>
+      </w:tr>
+      <w:tr>
+        <w:tc>
+          <w:tcPr>
+            <w:tcW w:type="dxa" w:w="2736"/>
+            <w:shd w:val="clear" w:color="auto" w:fill="EAF1F7"/>
+          </w:tcPr>
+          <w:p>
+            <w:pPr>
+              <w:spacing w:after="0" w:before="0"/>
+              <w:jc w:val="left"/>
+            </w:pPr>
+            <w:r/>
+            <w:r>
+              <w:rPr>
+                <w:b/>
+                <w:sz w:val="17"/>
+              </w:rPr>
+              <w:t>Top Speed</w:t>
+            </w:r>
+          </w:p>
+        </w:tc>
+        <w:tc>
+          <w:tcPr>
+            <w:tcW w:type="dxa" w:w="7344"/>
+          </w:tcPr>
+          <w:p>
+            <w:pPr>
+              <w:spacing w:after="0" w:before="0"/>
+              <w:jc w:val="left"/>
+            </w:pPr>
+            <w:r/>
+            <w:r>
+              <w:rPr>
+                <w:b w:val="0"/>
+                <w:sz w:val="17"/>
+              </w:rPr>
+              <w:t>Sprint speed in feet/second (Statcast). The structural baseline a runner is born with.</w:t>
+            </w:r>
+          </w:p>
+        </w:tc>
+      </w:tr>
+      <w:tr>
+        <w:tc>
+          <w:tcPr>
+            <w:tcW w:type="dxa" w:w="2736"/>
+            <w:shd w:val="clear" w:color="auto" w:fill="EAF1F7"/>
+          </w:tcPr>
+          <w:p>
+            <w:pPr>
+              <w:spacing w:after="0" w:before="0"/>
+              <w:jc w:val="left"/>
+            </w:pPr>
+            <w:r/>
+            <w:r>
+              <w:rPr>
+                <w:b/>
+                <w:sz w:val="17"/>
+              </w:rPr>
+              <w:t>Jump</w:t>
+            </w:r>
+          </w:p>
+        </w:tc>
+        <w:tc>
+          <w:tcPr>
+            <w:tcW w:type="dxa" w:w="7344"/>
+          </w:tcPr>
+          <w:p>
+            <w:pPr>
+              <w:spacing w:after="0" w:before="0"/>
+              <w:jc w:val="left"/>
+            </w:pPr>
+            <w:r/>
+            <w:r>
+              <w:rPr>
+                <w:b w:val="0"/>
+                <w:sz w:val="17"/>
+              </w:rPr>
+              <w:t>Seconds to cover the first 30 ft. Lower = quicker first step. Coachable.</w:t>
+            </w:r>
+          </w:p>
+        </w:tc>
+      </w:tr>
+      <w:tr>
+        <w:tc>
+          <w:tcPr>
+            <w:tcW w:type="dxa" w:w="2736"/>
+            <w:shd w:val="clear" w:color="auto" w:fill="EAF1F7"/>
+          </w:tcPr>
+          <w:p>
+            <w:pPr>
+              <w:spacing w:after="0" w:before="0"/>
+              <w:jc w:val="left"/>
+            </w:pPr>
+            <w:r/>
+            <w:r>
+              <w:rPr>
+                <w:b/>
+                <w:sz w:val="17"/>
+              </w:rPr>
+              <w:t>First-Step Burst</w:t>
+            </w:r>
+          </w:p>
+        </w:tc>
+        <w:tc>
+          <w:tcPr>
+            <w:tcW w:type="dxa" w:w="7344"/>
+          </w:tcPr>
+          <w:p>
+            <w:pPr>
+              <w:spacing w:after="0" w:before="0"/>
+              <w:jc w:val="left"/>
+            </w:pPr>
+            <w:r/>
+            <w:r>
+              <w:rPr>
+                <w:b w:val="0"/>
+                <w:sz w:val="17"/>
+              </w:rPr>
+              <w:t>Reaches top speed in fewer feet than his speed predicts. A premium when paired with high speed.</w:t>
+            </w:r>
+          </w:p>
+        </w:tc>
+      </w:tr>
+      <w:tr>
+        <w:tc>
+          <w:tcPr>
+            <w:tcW w:type="dxa" w:w="2736"/>
+            <w:shd w:val="clear" w:color="auto" w:fill="EAF1F7"/>
+          </w:tcPr>
+          <w:p>
+            <w:pPr>
+              <w:spacing w:after="0" w:before="0"/>
+              <w:jc w:val="left"/>
+            </w:pPr>
+            <w:r/>
+            <w:r>
+              <w:rPr>
+                <w:b/>
+                <w:sz w:val="17"/>
+              </w:rPr>
+              <w:t>Steals Above Speed-Expected</w:t>
+            </w:r>
+          </w:p>
+        </w:tc>
+        <w:tc>
+          <w:tcPr>
+            <w:tcW w:type="dxa" w:w="7344"/>
+          </w:tcPr>
+          <w:p>
+            <w:pPr>
+              <w:spacing w:after="0" w:before="0"/>
+              <w:jc w:val="left"/>
+            </w:pPr>
+            <w:r/>
+            <w:r>
+              <w:rPr>
+                <w:b w:val="0"/>
+                <w:sz w:val="17"/>
+              </w:rPr>
+              <w:t>Real success rate minus the rate his sprint speed alone would predict. Positive = beats his speed peers.</w:t>
+            </w:r>
+          </w:p>
+        </w:tc>
+      </w:tr>
+      <w:tr>
+        <w:tc>
+          <w:tcPr>
+            <w:tcW w:type="dxa" w:w="2736"/>
+            <w:shd w:val="clear" w:color="auto" w:fill="EAF1F7"/>
+          </w:tcPr>
+          <w:p>
+            <w:pPr>
+              <w:spacing w:after="0" w:before="0"/>
+              <w:jc w:val="left"/>
+            </w:pPr>
+            <w:r/>
+            <w:r>
+              <w:rPr>
+                <w:b/>
+                <w:sz w:val="17"/>
+              </w:rPr>
+              <w:t>Steal Value (xSB)</w:t>
+            </w:r>
+          </w:p>
+        </w:tc>
+        <w:tc>
+          <w:tcPr>
+            <w:tcW w:type="dxa" w:w="7344"/>
+          </w:tcPr>
+          <w:p>
+            <w:pPr>
+              <w:spacing w:after="0" w:before="0"/>
+              <w:jc w:val="left"/>
+            </w:pPr>
+            <w:r/>
+            <w:r>
+              <w:rPr>
+                <w:b w:val="0"/>
+                <w:sz w:val="17"/>
+              </w:rPr>
+              <w:t>Speed AND production combined: z(net steals above avg) + z(top speed). Surfaces fast, high-volume burners.</w:t>
+            </w:r>
+          </w:p>
+        </w:tc>
+      </w:tr>
+      <w:tr>
+        <w:tc>
+          <w:tcPr>
+            <w:tcW w:type="dxa" w:w="2736"/>
+            <w:shd w:val="clear" w:color="auto" w:fill="EAF1F7"/>
+          </w:tcPr>
+          <w:p>
+            <w:pPr>
+              <w:spacing w:after="0" w:before="0"/>
+              <w:jc w:val="left"/>
+            </w:pPr>
+            <w:r/>
+            <w:r>
+              <w:rPr>
+                <w:b/>
+                <w:sz w:val="17"/>
+              </w:rPr>
+              <w:t>Untapped Speed</w:t>
+            </w:r>
+          </w:p>
+        </w:tc>
+        <w:tc>
+          <w:tcPr>
+            <w:tcW w:type="dxa" w:w="7344"/>
+          </w:tcPr>
+          <w:p>
+            <w:pPr>
+              <w:spacing w:after="0" w:before="0"/>
+              <w:jc w:val="left"/>
+            </w:pPr>
+            <w:r/>
+            <w:r>
+              <w:rPr>
+                <w:b w:val="0"/>
+                <w:sz w:val="17"/>
+              </w:rPr>
+              <w:t>Fast but under-stealing — z(top speed) minus z(net steals). The clearest coaching targets.</w:t>
+            </w:r>
+          </w:p>
+        </w:tc>
+      </w:tr>
+    </w:tbl>
     <w:sectPr>
       <w:pgSz w:w="12240" w:h="15840"/>
       <w:pgMar w:top="864" w:right="1008" w:bottom="864" w:left="1008" w:header="720" w:footer="720" w:gutter="0"/>

</xml_diff>

<commit_message>
Report v10: steals units, Ground Gained, speed-stripping explainer, McMahon BCS
- Drop "pts" everywhere; all payoffs now in extra steals per 20 attempts
- Add Ground Gained (avg_post_release_distance) column to §2 SSSI table
- Add HOW WE STRIP SPEED OUT callout + Fig_GroundCovered_Scatter before table
- Add §2b: McMahon BCS per-season leaderboard with team logos
- READING THE NUMBERS box on page 1 explains the steals unit upfront
- 80/20 teaser leads with steal counts from page 1
- §4 caveats: "steal projections" not "bag counts"; clean all remaining "bags" from report body
</commit_message>
<xml_diff>
--- a/Naylor_Model_v8_Report.docx
+++ b/Naylor_Model_v8_Report.docx
@@ -45,7 +45,7 @@
           <w:b/>
           <w:sz w:val="20"/>
         </w:rPr>
-        <w:t>Some of the best base-stealers in baseball are among its slowest runners. This report measures the skill speed hides, gives you the equation for what that skill is worth, and hands you a 2025 list of exactly who to coach and the steals it adds.</w:t>
+        <w:t>Some of the best base-stealers in baseball are among its slowest. This report measures the skill speed hides, prices each skill in steals, and names who to coach in 2025.</w:t>
       </w:r>
     </w:p>
     <w:p>
@@ -56,7 +56,7 @@
         <w:rPr>
           <w:sz w:val="20"/>
         </w:rPr>
-        <w:t>The model is named for the clearest living example of one quality — a runner who steals better than ~99% of the league despite bottom-of-the-league speed. In 2025 Josh Naylor stole 30 bases at 92% while running slower than 98% of MLB: the #1 steal-skill season in our data of 673. But this is not a report about one player. It is about the quality he exemplifies — a quick jump, an explosive secondary lead, and reading the pitcher early — which shows up all over the league and, unlike foot speed, is coachable. The next four pages give you (1) the equation for what each skill is worth, (2) the runners who already have it, (3) a 2025 target board of who to develop and the projected prize, and (4) the three drills that move the needle most.</w:t>
+        <w:t>Named for its clearest example: in 2025 Josh Naylor stole 30 bases at 92% while slower than 98% of MLB — the top steal-skill season in our 673. But the subject is the quality, not the player: a quick jump, an explosive secondary lead, and reading the pitcher early. Unlike foot speed, all three are coachable — and found league-wide. Four pages: (1) what each skill is worth, (2) who already has it, (3) who to coach in 2025, (4) the drills.</w:t>
       </w:r>
     </w:p>
     <w:tbl>
@@ -87,7 +87,7 @@
                 <w:color w:val="FFFFFF"/>
                 <w:sz w:val="21"/>
               </w:rPr>
-              <w:t>READING THE NUMBERS  ·  the 10-second key</w:t>
+              <w:t>READING THE NUMBERS</w:t>
             </w:r>
           </w:p>
         </w:tc>
@@ -109,13 +109,13 @@
                 <w:color w:val="2C3E50"/>
                 <w:sz w:val="19"/>
               </w:rPr>
-              <w:t xml:space="preserve">"pts" = steals.  </w:t>
+              <w:t xml:space="preserve">Everything is in steals.  </w:t>
             </w:r>
             <w:r>
               <w:rPr>
                 <w:sz w:val="19"/>
               </w:rPr>
-              <w:t>"pts" is the gain in steal-success rate. We never make you do the math — every "pts" is also printed as steals. Rule of thumb: +5 pts ≈ one extra stolen base (and one fewer caught) per 20 tries. So "+25 pts" ≈ +5 steals a season.</w:t>
+              <w:t>Each skill's payoff is the extra stolen bases it adds over a 20-attempt season. The top skill is worth about +5 steals.</w:t>
             </w:r>
           </w:p>
           <w:p>
@@ -134,7 +134,7 @@
               <w:rPr>
                 <w:sz w:val="19"/>
               </w:rPr>
-              <w:t>Green = best of the players shown, red = worst of those shown (can still beat the MLB average), gold = the Naylor/Soto archetype. The charts use no red — every runner shown is already elite.</w:t>
+              <w:t>Green = best shown, red = worst shown (can still beat the MLB average), gold = the Naylor/Soto archetype. Charts use no red — everyone shown is already elite.</w:t>
             </w:r>
           </w:p>
           <w:p>
@@ -153,7 +153,7 @@
               <w:rPr>
                 <w:sz w:val="19"/>
               </w:rPr>
-              <w:t>Deciding who to develop and what to drill — not predicting any single steal (stealing is high-variance; the model's accuracy is in the Appendix).</w:t>
+              <w:t>Who to develop and what to drill — not calling any single steal (model accuracy is in the Appendix).</w:t>
             </w:r>
           </w:p>
         </w:tc>
@@ -222,13 +222,13 @@
                 <w:color w:val="2E7D32"/>
                 <w:sz w:val="19"/>
               </w:rPr>
-              <w:t xml:space="preserve">≈ +5 steals / 20 tries  </w:t>
+              <w:t xml:space="preserve">+5 steals / 20 tries  </w:t>
             </w:r>
             <w:r>
               <w:rPr>
                 <w:sz w:val="19"/>
               </w:rPr>
-              <w:t>Ground covered after the pitcher commits  (+25 pts for a +1-step gain).</w:t>
+              <w:t>Ground covered after the pitcher commits.</w:t>
             </w:r>
           </w:p>
           <w:p>
@@ -241,13 +241,13 @@
                 <w:color w:val="2E7D32"/>
                 <w:sz w:val="19"/>
               </w:rPr>
-              <w:t xml:space="preserve">≈ +3 steals / 20 tries  </w:t>
+              <w:t xml:space="preserve">+3 steals / 20 tries  </w:t>
             </w:r>
             <w:r>
               <w:rPr>
                 <w:sz w:val="19"/>
               </w:rPr>
-              <w:t>Jump — quickness over the first 30 ft  (+17 pts for a +1-step gain).</w:t>
+              <w:t>Jump — quickness over the first 30 ft.</w:t>
             </w:r>
           </w:p>
           <w:p>
@@ -260,13 +260,13 @@
                 <w:color w:val="2E7D32"/>
                 <w:sz w:val="19"/>
               </w:rPr>
-              <w:t xml:space="preserve">≈ +2 steals / 20 tries  </w:t>
+              <w:t xml:space="preserve">+2 steals / 20 tries  </w:t>
             </w:r>
             <w:r>
               <w:rPr>
                 <w:sz w:val="19"/>
               </w:rPr>
-              <w:t>First-step quickness vs. top speed  (+10 pts for a +1-step gain).</w:t>
+              <w:t>First-step quickness vs. top speed.</w:t>
             </w:r>
           </w:p>
         </w:tc>
@@ -285,7 +285,7 @@
         <w:rPr>
           <w:sz w:val="19"/>
         </w:rPr>
-        <w:t>All three are technique, not body type — which is why a slow runner can lead the league in steal skill. Section 1 shows the full equation behind these; Section 4 turns them into drills.</w:t>
+        <w:t>All three are technique, not body type — which is why a slow runner can lead the league in steal skill. Section 1 prices them in full; Section 4 turns them into drills.</w:t>
       </w:r>
     </w:p>
     <w:p>
@@ -298,7 +298,7 @@
         <w:pStyle w:val="Heading1"/>
       </w:pPr>
       <w:r>
-        <w:t>1  What Each Skill Is Worth — The Steal-Success Equation</w:t>
+        <w:t>1  What Each Skill Is Worth — in Steals</w:t>
       </w:r>
     </w:p>
     <w:p>
@@ -317,7 +317,7 @@
         <w:rPr>
           <w:sz w:val="19"/>
         </w:rPr>
-        <w:t>We fit an interpretable model (a logistic GLM) on Statcast runner-seasons that isolates how each skill changes the chance of a successful steal, then converted every weight into plain points of success rate for one realistic one-standard-deviation (1-SD) improvement — and into concrete steals.</w:t>
+        <w:t>We fit a model on Statcast runner-seasons that isolates how much each skill changes the chance of a successful steal, then priced every skill in the only unit that matters to a coach: extra stolen bases from one realistic, off-season-sized improvement.</w:t>
       </w:r>
     </w:p>
     <w:p>
@@ -337,7 +337,7 @@
           <w:b/>
           <w:sz w:val="20"/>
         </w:rPr>
-        <w:t>Three trainable levers dominate — covering ground after the pitcher commits, a quicker jump, and reaching top speed sooner. Raw foot speed barely moves the needle.</w:t>
+        <w:t>Three trainable skills dominate — covering ground after the pitcher commits, a quicker jump, and reaching top speed sooner. Raw foot speed barely moves the needle.</w:t>
       </w:r>
     </w:p>
     <w:p>
@@ -424,33 +424,13 @@
           <w:b/>
           <w:sz w:val="17"/>
         </w:rPr>
-        <w:t xml:space="preserve">Success-Rate Change — </w:t>
+        <w:t xml:space="preserve">Added steals — </w:t>
       </w:r>
       <w:r>
         <w:rPr>
           <w:sz w:val="17"/>
         </w:rPr>
-        <w:t>Percentage-point change in SB success from that one-step gain.</w:t>
-      </w:r>
-    </w:p>
-    <w:p>
-      <w:pPr>
-        <w:pStyle w:val="ListBullet"/>
-        <w:spacing w:after="0"/>
-        <w:ind w:left="360"/>
-      </w:pPr>
-      <w:r>
-        <w:rPr>
-          <w:b/>
-          <w:sz w:val="17"/>
-        </w:rPr>
-        <w:t xml:space="preserve">Extra steals — </w:t>
-      </w:r>
-      <w:r>
-        <w:rPr>
-          <w:sz w:val="17"/>
-        </w:rPr>
-        <w:t>Plain translation of the success-rate change into net bags over a typical 20-attempt season.</w:t>
+        <w:t>Extra stolen bases over a 20-attempt season from one realistic improvement in that skill.</w:t>
       </w:r>
     </w:p>
     <w:p>
@@ -460,7 +440,7 @@
       <w:r>
         <w:drawing>
           <wp:inline xmlns:a="http://schemas.openxmlformats.org/drawingml/2006/main" xmlns:pic="http://schemas.openxmlformats.org/drawingml/2006/picture">
-            <wp:extent cx="6400800" cy="4160818"/>
+            <wp:extent cx="6400800" cy="4669200"/>
             <wp:docPr id="1" name="Picture 1"/>
             <wp:cNvGraphicFramePr>
               <a:graphicFrameLocks noChangeAspect="1"/>
@@ -481,7 +461,7 @@
                   <pic:spPr>
                     <a:xfrm>
                       <a:off x="0" y="0"/>
-                      <a:ext cx="6400800" cy="4160818"/>
+                      <a:ext cx="6400800" cy="4669200"/>
                     </a:xfrm>
                     <a:prstGeom prst="rect"/>
                   </pic:spPr>
@@ -502,7 +482,7 @@
           <w:color w:val="666666"/>
           <w:sz w:val="17"/>
         </w:rPr>
-        <w:t>Figure 1 — Each bar is the standardized weight β: the change in steal-success rate from a +1-SD improvement in that one skill (also shown as net bags / 20 attempts). Green = trainable, grey = opponent/situation context, orange = raw speed. The equation at top: success odds = baseline + Σ (weight × how many SDs above average the runner is).</w:t>
+        <w:t>Figure 1 — Extra steals over a 20-attempt season from a one-step (a focused off-season's worth) improvement in each skill. Green = trainable, grey = opponent/situation, orange = raw speed. Longer bar = bigger coaching payoff.</w:t>
       </w:r>
     </w:p>
     <w:tbl>
@@ -513,17 +493,16 @@
         <w:tblLook w:firstColumn="1" w:firstRow="1" w:lastColumn="0" w:lastRow="0" w:noHBand="0" w:noVBand="1" w:val="04A0"/>
       </w:tblPr>
       <w:tblGrid>
-        <w:gridCol w:w="1704"/>
-        <w:gridCol w:w="1704"/>
-        <w:gridCol w:w="1704"/>
-        <w:gridCol w:w="1704"/>
-        <w:gridCol w:w="1704"/>
-        <w:gridCol w:w="1704"/>
+        <w:gridCol w:w="2045"/>
+        <w:gridCol w:w="2045"/>
+        <w:gridCol w:w="2045"/>
+        <w:gridCol w:w="2045"/>
+        <w:gridCol w:w="2045"/>
       </w:tblGrid>
       <w:tr>
         <w:tc>
           <w:tcPr>
-            <w:tcW w:type="dxa" w:w="1704"/>
+            <w:tcW w:type="dxa" w:w="2045"/>
             <w:shd w:val="clear" w:color="auto" w:fill="2C3E50"/>
           </w:tcPr>
           <w:p>
@@ -547,7 +526,7 @@
         </w:tc>
         <w:tc>
           <w:tcPr>
-            <w:tcW w:type="dxa" w:w="1704"/>
+            <w:tcW w:type="dxa" w:w="2045"/>
             <w:shd w:val="clear" w:color="auto" w:fill="2C3E50"/>
           </w:tcPr>
           <w:p>
@@ -573,7 +552,7 @@
         </w:tc>
         <w:tc>
           <w:tcPr>
-            <w:tcW w:type="dxa" w:w="1704"/>
+            <w:tcW w:type="dxa" w:w="2045"/>
             <w:shd w:val="clear" w:color="auto" w:fill="2C3E50"/>
           </w:tcPr>
           <w:p>
@@ -593,13 +572,13 @@
               </w:rPr>
               <w:t>One-Step</w:t>
               <w:br/>
-              <w:t>(+1 SD)</w:t>
+              <w:t>Improvement</w:t>
             </w:r>
           </w:p>
         </w:tc>
         <w:tc>
           <w:tcPr>
-            <w:tcW w:type="dxa" w:w="1704"/>
+            <w:tcW w:type="dxa" w:w="2045"/>
             <w:shd w:val="clear" w:color="auto" w:fill="2C3E50"/>
           </w:tcPr>
           <w:p>
@@ -617,41 +596,15 @@
                 <w:b/>
                 <w:sz w:val="17"/>
               </w:rPr>
-              <w:t>Success Rate</w:t>
+              <w:t>Added steals</w:t>
               <w:br/>
-              <w:t>Change (pts)</w:t>
+              <w:t>(per 20 tries)</w:t>
             </w:r>
           </w:p>
         </w:tc>
         <w:tc>
           <w:tcPr>
-            <w:tcW w:type="dxa" w:w="1704"/>
-            <w:shd w:val="clear" w:color="auto" w:fill="2C3E50"/>
-          </w:tcPr>
-          <w:p>
-            <w:pPr>
-              <w:spacing w:after="0" w:before="0"/>
-              <w:jc w:val="center"/>
-            </w:pPr>
-            <w:r>
-              <w:rPr>
-                <w:color w:val="FFFFFF"/>
-              </w:rPr>
-            </w:r>
-            <w:r>
-              <w:rPr>
-                <w:b/>
-                <w:sz w:val="17"/>
-              </w:rPr>
-              <w:t>≈ Extra steals</w:t>
-              <w:br/>
-              <w:t>(per 20 tries)</w:t>
-            </w:r>
-          </w:p>
-        </w:tc>
-        <w:tc>
-          <w:tcPr>
-            <w:tcW w:type="dxa" w:w="1704"/>
+            <w:tcW w:type="dxa" w:w="2045"/>
             <w:shd w:val="clear" w:color="auto" w:fill="2C3E50"/>
           </w:tcPr>
           <w:p>
@@ -677,7 +630,7 @@
       <w:tr>
         <w:tc>
           <w:tcPr>
-            <w:tcW w:type="dxa" w:w="1704"/>
+            <w:tcW w:type="dxa" w:w="2045"/>
           </w:tcPr>
           <w:p>
             <w:pPr>
@@ -696,7 +649,7 @@
         </w:tc>
         <w:tc>
           <w:tcPr>
-            <w:tcW w:type="dxa" w:w="1704"/>
+            <w:tcW w:type="dxa" w:w="2045"/>
           </w:tcPr>
           <w:p>
             <w:pPr>
@@ -715,7 +668,7 @@
         </w:tc>
         <w:tc>
           <w:tcPr>
-            <w:tcW w:type="dxa" w:w="1704"/>
+            <w:tcW w:type="dxa" w:w="2045"/>
           </w:tcPr>
           <w:p>
             <w:pPr>
@@ -734,7 +687,7 @@
         </w:tc>
         <w:tc>
           <w:tcPr>
-            <w:tcW w:type="dxa" w:w="1704"/>
+            <w:tcW w:type="dxa" w:w="2045"/>
             <w:shd w:val="clear" w:color="auto" w:fill="4CAF5F"/>
           </w:tcPr>
           <w:p>
@@ -748,13 +701,13 @@
                 <w:b w:val="0"/>
                 <w:sz w:val="18"/>
               </w:rPr>
-              <w:t>+25 pts</w:t>
+              <w:t>+5</w:t>
             </w:r>
           </w:p>
         </w:tc>
         <w:tc>
           <w:tcPr>
-            <w:tcW w:type="dxa" w:w="1704"/>
+            <w:tcW w:type="dxa" w:w="2045"/>
           </w:tcPr>
           <w:p>
             <w:pPr>
@@ -767,26 +720,7 @@
                 <w:b w:val="0"/>
                 <w:sz w:val="18"/>
               </w:rPr>
-              <w:t>+5 bags/20</w:t>
-            </w:r>
-          </w:p>
-        </w:tc>
-        <w:tc>
-          <w:tcPr>
-            <w:tcW w:type="dxa" w:w="1704"/>
-          </w:tcPr>
-          <w:p>
-            <w:pPr>
-              <w:spacing w:after="0" w:before="0"/>
-              <w:jc w:val="center"/>
-            </w:pPr>
-            <w:r/>
-            <w:r>
-              <w:rPr>
-                <w:b w:val="0"/>
-                <w:sz w:val="18"/>
-              </w:rPr>
-              <w:t>↑ raises</w:t>
+              <w:t>↑ helps</w:t>
             </w:r>
           </w:p>
         </w:tc>
@@ -794,7 +728,7 @@
       <w:tr>
         <w:tc>
           <w:tcPr>
-            <w:tcW w:type="dxa" w:w="1704"/>
+            <w:tcW w:type="dxa" w:w="2045"/>
           </w:tcPr>
           <w:p>
             <w:pPr>
@@ -813,7 +747,7 @@
         </w:tc>
         <w:tc>
           <w:tcPr>
-            <w:tcW w:type="dxa" w:w="1704"/>
+            <w:tcW w:type="dxa" w:w="2045"/>
           </w:tcPr>
           <w:p>
             <w:pPr>
@@ -832,7 +766,7 @@
         </w:tc>
         <w:tc>
           <w:tcPr>
-            <w:tcW w:type="dxa" w:w="1704"/>
+            <w:tcW w:type="dxa" w:w="2045"/>
           </w:tcPr>
           <w:p>
             <w:pPr>
@@ -851,7 +785,7 @@
         </w:tc>
         <w:tc>
           <w:tcPr>
-            <w:tcW w:type="dxa" w:w="1704"/>
+            <w:tcW w:type="dxa" w:w="2045"/>
             <w:shd w:val="clear" w:color="auto" w:fill="7CC489"/>
           </w:tcPr>
           <w:p>
@@ -865,13 +799,13 @@
                 <w:b w:val="0"/>
                 <w:sz w:val="18"/>
               </w:rPr>
-              <w:t>+17 pts</w:t>
+              <w:t>+3</w:t>
             </w:r>
           </w:p>
         </w:tc>
         <w:tc>
           <w:tcPr>
-            <w:tcW w:type="dxa" w:w="1704"/>
+            <w:tcW w:type="dxa" w:w="2045"/>
           </w:tcPr>
           <w:p>
             <w:pPr>
@@ -884,26 +818,7 @@
                 <w:b w:val="0"/>
                 <w:sz w:val="18"/>
               </w:rPr>
-              <w:t>+3 bags/20</w:t>
-            </w:r>
-          </w:p>
-        </w:tc>
-        <w:tc>
-          <w:tcPr>
-            <w:tcW w:type="dxa" w:w="1704"/>
-          </w:tcPr>
-          <w:p>
-            <w:pPr>
-              <w:spacing w:after="0" w:before="0"/>
-              <w:jc w:val="center"/>
-            </w:pPr>
-            <w:r/>
-            <w:r>
-              <w:rPr>
-                <w:b w:val="0"/>
-                <w:sz w:val="18"/>
-              </w:rPr>
-              <w:t>↑ raises</w:t>
+              <w:t>↑ helps</w:t>
             </w:r>
           </w:p>
         </w:tc>
@@ -911,7 +826,7 @@
       <w:tr>
         <w:tc>
           <w:tcPr>
-            <w:tcW w:type="dxa" w:w="1704"/>
+            <w:tcW w:type="dxa" w:w="2045"/>
           </w:tcPr>
           <w:p>
             <w:pPr>
@@ -930,7 +845,7 @@
         </w:tc>
         <w:tc>
           <w:tcPr>
-            <w:tcW w:type="dxa" w:w="1704"/>
+            <w:tcW w:type="dxa" w:w="2045"/>
           </w:tcPr>
           <w:p>
             <w:pPr>
@@ -949,7 +864,7 @@
         </w:tc>
         <w:tc>
           <w:tcPr>
-            <w:tcW w:type="dxa" w:w="1704"/>
+            <w:tcW w:type="dxa" w:w="2045"/>
           </w:tcPr>
           <w:p>
             <w:pPr>
@@ -968,7 +883,7 @@
         </w:tc>
         <w:tc>
           <w:tcPr>
-            <w:tcW w:type="dxa" w:w="1704"/>
+            <w:tcW w:type="dxa" w:w="2045"/>
             <w:shd w:val="clear" w:color="auto" w:fill="D86256"/>
           </w:tcPr>
           <w:p>
@@ -982,13 +897,13 @@
                 <w:b w:val="0"/>
                 <w:sz w:val="18"/>
               </w:rPr>
-              <w:t>-12 pts</w:t>
+              <w:t>-2</w:t>
             </w:r>
           </w:p>
         </w:tc>
         <w:tc>
           <w:tcPr>
-            <w:tcW w:type="dxa" w:w="1704"/>
+            <w:tcW w:type="dxa" w:w="2045"/>
           </w:tcPr>
           <w:p>
             <w:pPr>
@@ -1001,26 +916,7 @@
                 <w:b w:val="0"/>
                 <w:sz w:val="18"/>
               </w:rPr>
-              <w:t>-2 bags/20</w:t>
-            </w:r>
-          </w:p>
-        </w:tc>
-        <w:tc>
-          <w:tcPr>
-            <w:tcW w:type="dxa" w:w="1704"/>
-          </w:tcPr>
-          <w:p>
-            <w:pPr>
-              <w:spacing w:after="0" w:before="0"/>
-              <w:jc w:val="center"/>
-            </w:pPr>
-            <w:r/>
-            <w:r>
-              <w:rPr>
-                <w:b w:val="0"/>
-                <w:sz w:val="18"/>
-              </w:rPr>
-              <w:t>↓ lowers</w:t>
+              <w:t>↓ hurts</w:t>
             </w:r>
           </w:p>
         </w:tc>
@@ -1028,7 +924,7 @@
       <w:tr>
         <w:tc>
           <w:tcPr>
-            <w:tcW w:type="dxa" w:w="1704"/>
+            <w:tcW w:type="dxa" w:w="2045"/>
           </w:tcPr>
           <w:p>
             <w:pPr>
@@ -1047,7 +943,7 @@
         </w:tc>
         <w:tc>
           <w:tcPr>
-            <w:tcW w:type="dxa" w:w="1704"/>
+            <w:tcW w:type="dxa" w:w="2045"/>
           </w:tcPr>
           <w:p>
             <w:pPr>
@@ -1066,7 +962,7 @@
         </w:tc>
         <w:tc>
           <w:tcPr>
-            <w:tcW w:type="dxa" w:w="1704"/>
+            <w:tcW w:type="dxa" w:w="2045"/>
           </w:tcPr>
           <w:p>
             <w:pPr>
@@ -1085,7 +981,7 @@
         </w:tc>
         <w:tc>
           <w:tcPr>
-            <w:tcW w:type="dxa" w:w="1704"/>
+            <w:tcW w:type="dxa" w:w="2045"/>
             <w:shd w:val="clear" w:color="auto" w:fill="C7E6CD"/>
           </w:tcPr>
           <w:p>
@@ -1099,13 +995,13 @@
                 <w:b w:val="0"/>
                 <w:sz w:val="18"/>
               </w:rPr>
-              <w:t>+10 pts</w:t>
+              <w:t>+2</w:t>
             </w:r>
           </w:p>
         </w:tc>
         <w:tc>
           <w:tcPr>
-            <w:tcW w:type="dxa" w:w="1704"/>
+            <w:tcW w:type="dxa" w:w="2045"/>
           </w:tcPr>
           <w:p>
             <w:pPr>
@@ -1118,26 +1014,7 @@
                 <w:b w:val="0"/>
                 <w:sz w:val="18"/>
               </w:rPr>
-              <w:t>+2 bags/20</w:t>
-            </w:r>
-          </w:p>
-        </w:tc>
-        <w:tc>
-          <w:tcPr>
-            <w:tcW w:type="dxa" w:w="1704"/>
-          </w:tcPr>
-          <w:p>
-            <w:pPr>
-              <w:spacing w:after="0" w:before="0"/>
-              <w:jc w:val="center"/>
-            </w:pPr>
-            <w:r/>
-            <w:r>
-              <w:rPr>
-                <w:b w:val="0"/>
-                <w:sz w:val="18"/>
-              </w:rPr>
-              <w:t>↑ raises</w:t>
+              <w:t>↑ helps</w:t>
             </w:r>
           </w:p>
         </w:tc>
@@ -1145,7 +1022,7 @@
       <w:tr>
         <w:tc>
           <w:tcPr>
-            <w:tcW w:type="dxa" w:w="1704"/>
+            <w:tcW w:type="dxa" w:w="2045"/>
           </w:tcPr>
           <w:p>
             <w:pPr>
@@ -1164,7 +1041,7 @@
         </w:tc>
         <w:tc>
           <w:tcPr>
-            <w:tcW w:type="dxa" w:w="1704"/>
+            <w:tcW w:type="dxa" w:w="2045"/>
           </w:tcPr>
           <w:p>
             <w:pPr>
@@ -1183,7 +1060,7 @@
         </w:tc>
         <w:tc>
           <w:tcPr>
-            <w:tcW w:type="dxa" w:w="1704"/>
+            <w:tcW w:type="dxa" w:w="2045"/>
           </w:tcPr>
           <w:p>
             <w:pPr>
@@ -1202,7 +1079,7 @@
         </w:tc>
         <w:tc>
           <w:tcPr>
-            <w:tcW w:type="dxa" w:w="1704"/>
+            <w:tcW w:type="dxa" w:w="2045"/>
             <w:shd w:val="clear" w:color="auto" w:fill="E5968E"/>
           </w:tcPr>
           <w:p>
@@ -1216,13 +1093,13 @@
                 <w:b w:val="0"/>
                 <w:sz w:val="18"/>
               </w:rPr>
-              <w:t>-7 pts</w:t>
+              <w:t>-1</w:t>
             </w:r>
           </w:p>
         </w:tc>
         <w:tc>
           <w:tcPr>
-            <w:tcW w:type="dxa" w:w="1704"/>
+            <w:tcW w:type="dxa" w:w="2045"/>
           </w:tcPr>
           <w:p>
             <w:pPr>
@@ -1235,26 +1112,7 @@
                 <w:b w:val="0"/>
                 <w:sz w:val="18"/>
               </w:rPr>
-              <w:t>-1 bags/20</w:t>
-            </w:r>
-          </w:p>
-        </w:tc>
-        <w:tc>
-          <w:tcPr>
-            <w:tcW w:type="dxa" w:w="1704"/>
-          </w:tcPr>
-          <w:p>
-            <w:pPr>
-              <w:spacing w:after="0" w:before="0"/>
-              <w:jc w:val="center"/>
-            </w:pPr>
-            <w:r/>
-            <w:r>
-              <w:rPr>
-                <w:b w:val="0"/>
-                <w:sz w:val="18"/>
-              </w:rPr>
-              <w:t>↓ lowers</w:t>
+              <w:t>↓ hurts</w:t>
             </w:r>
           </w:p>
         </w:tc>
@@ -1262,7 +1120,7 @@
       <w:tr>
         <w:tc>
           <w:tcPr>
-            <w:tcW w:type="dxa" w:w="1704"/>
+            <w:tcW w:type="dxa" w:w="2045"/>
           </w:tcPr>
           <w:p>
             <w:pPr>
@@ -1281,7 +1139,7 @@
         </w:tc>
         <w:tc>
           <w:tcPr>
-            <w:tcW w:type="dxa" w:w="1704"/>
+            <w:tcW w:type="dxa" w:w="2045"/>
           </w:tcPr>
           <w:p>
             <w:pPr>
@@ -1300,7 +1158,7 @@
         </w:tc>
         <w:tc>
           <w:tcPr>
-            <w:tcW w:type="dxa" w:w="1704"/>
+            <w:tcW w:type="dxa" w:w="2045"/>
           </w:tcPr>
           <w:p>
             <w:pPr>
@@ -1319,7 +1177,7 @@
         </w:tc>
         <w:tc>
           <w:tcPr>
-            <w:tcW w:type="dxa" w:w="1704"/>
+            <w:tcW w:type="dxa" w:w="2045"/>
             <w:shd w:val="clear" w:color="auto" w:fill="FEFEFE"/>
           </w:tcPr>
           <w:p>
@@ -1333,13 +1191,13 @@
                 <w:b w:val="0"/>
                 <w:sz w:val="18"/>
               </w:rPr>
-              <w:t>+4 pts</w:t>
+              <w:t>+1</w:t>
             </w:r>
           </w:p>
         </w:tc>
         <w:tc>
           <w:tcPr>
-            <w:tcW w:type="dxa" w:w="1704"/>
+            <w:tcW w:type="dxa" w:w="2045"/>
           </w:tcPr>
           <w:p>
             <w:pPr>
@@ -1352,26 +1210,7 @@
                 <w:b w:val="0"/>
                 <w:sz w:val="18"/>
               </w:rPr>
-              <w:t>+1 bags/20</w:t>
-            </w:r>
-          </w:p>
-        </w:tc>
-        <w:tc>
-          <w:tcPr>
-            <w:tcW w:type="dxa" w:w="1704"/>
-          </w:tcPr>
-          <w:p>
-            <w:pPr>
-              <w:spacing w:after="0" w:before="0"/>
-              <w:jc w:val="center"/>
-            </w:pPr>
-            <w:r/>
-            <w:r>
-              <w:rPr>
-                <w:b w:val="0"/>
-                <w:sz w:val="18"/>
-              </w:rPr>
-              <w:t>↑ raises</w:t>
+              <w:t>↑ helps</w:t>
             </w:r>
           </w:p>
         </w:tc>
@@ -1379,7 +1218,7 @@
       <w:tr>
         <w:tc>
           <w:tcPr>
-            <w:tcW w:type="dxa" w:w="1704"/>
+            <w:tcW w:type="dxa" w:w="2045"/>
           </w:tcPr>
           <w:p>
             <w:pPr>
@@ -1398,7 +1237,7 @@
         </w:tc>
         <w:tc>
           <w:tcPr>
-            <w:tcW w:type="dxa" w:w="1704"/>
+            <w:tcW w:type="dxa" w:w="2045"/>
           </w:tcPr>
           <w:p>
             <w:pPr>
@@ -1417,7 +1256,7 @@
         </w:tc>
         <w:tc>
           <w:tcPr>
-            <w:tcW w:type="dxa" w:w="1704"/>
+            <w:tcW w:type="dxa" w:w="2045"/>
           </w:tcPr>
           <w:p>
             <w:pPr>
@@ -1436,7 +1275,7 @@
         </w:tc>
         <w:tc>
           <w:tcPr>
-            <w:tcW w:type="dxa" w:w="1704"/>
+            <w:tcW w:type="dxa" w:w="2045"/>
             <w:shd w:val="clear" w:color="auto" w:fill="FEFBFB"/>
           </w:tcPr>
           <w:p>
@@ -1450,13 +1289,13 @@
                 <w:b w:val="0"/>
                 <w:sz w:val="18"/>
               </w:rPr>
-              <w:t>+4 pts</w:t>
+              <w:t>+1</w:t>
             </w:r>
           </w:p>
         </w:tc>
         <w:tc>
           <w:tcPr>
-            <w:tcW w:type="dxa" w:w="1704"/>
+            <w:tcW w:type="dxa" w:w="2045"/>
           </w:tcPr>
           <w:p>
             <w:pPr>
@@ -1469,26 +1308,7 @@
                 <w:b w:val="0"/>
                 <w:sz w:val="18"/>
               </w:rPr>
-              <w:t>+1 bags/20</w:t>
-            </w:r>
-          </w:p>
-        </w:tc>
-        <w:tc>
-          <w:tcPr>
-            <w:tcW w:type="dxa" w:w="1704"/>
-          </w:tcPr>
-          <w:p>
-            <w:pPr>
-              <w:spacing w:after="0" w:before="0"/>
-              <w:jc w:val="center"/>
-            </w:pPr>
-            <w:r/>
-            <w:r>
-              <w:rPr>
-                <w:b w:val="0"/>
-                <w:sz w:val="18"/>
-              </w:rPr>
-              <w:t>↑ raises</w:t>
+              <w:t>↑ helps</w:t>
             </w:r>
           </w:p>
         </w:tc>
@@ -1496,7 +1316,7 @@
       <w:tr>
         <w:tc>
           <w:tcPr>
-            <w:tcW w:type="dxa" w:w="1704"/>
+            <w:tcW w:type="dxa" w:w="2045"/>
           </w:tcPr>
           <w:p>
             <w:pPr>
@@ -1515,7 +1335,7 @@
         </w:tc>
         <w:tc>
           <w:tcPr>
-            <w:tcW w:type="dxa" w:w="1704"/>
+            <w:tcW w:type="dxa" w:w="2045"/>
           </w:tcPr>
           <w:p>
             <w:pPr>
@@ -1534,7 +1354,7 @@
         </w:tc>
         <w:tc>
           <w:tcPr>
-            <w:tcW w:type="dxa" w:w="1704"/>
+            <w:tcW w:type="dxa" w:w="2045"/>
           </w:tcPr>
           <w:p>
             <w:pPr>
@@ -1553,7 +1373,7 @@
         </w:tc>
         <w:tc>
           <w:tcPr>
-            <w:tcW w:type="dxa" w:w="1704"/>
+            <w:tcW w:type="dxa" w:w="2045"/>
             <w:shd w:val="clear" w:color="auto" w:fill="EBAEA8"/>
           </w:tcPr>
           <w:p>
@@ -1567,13 +1387,13 @@
                 <w:b w:val="0"/>
                 <w:sz w:val="18"/>
               </w:rPr>
-              <w:t>-4 pts</w:t>
+              <w:t>-1</w:t>
             </w:r>
           </w:p>
         </w:tc>
         <w:tc>
           <w:tcPr>
-            <w:tcW w:type="dxa" w:w="1704"/>
+            <w:tcW w:type="dxa" w:w="2045"/>
           </w:tcPr>
           <w:p>
             <w:pPr>
@@ -1586,26 +1406,7 @@
                 <w:b w:val="0"/>
                 <w:sz w:val="18"/>
               </w:rPr>
-              <w:t>-1 bags/20</w:t>
-            </w:r>
-          </w:p>
-        </w:tc>
-        <w:tc>
-          <w:tcPr>
-            <w:tcW w:type="dxa" w:w="1704"/>
-          </w:tcPr>
-          <w:p>
-            <w:pPr>
-              <w:spacing w:after="0" w:before="0"/>
-              <w:jc w:val="center"/>
-            </w:pPr>
-            <w:r/>
-            <w:r>
-              <w:rPr>
-                <w:b w:val="0"/>
-                <w:sz w:val="18"/>
-              </w:rPr>
-              <w:t>↓ lowers</w:t>
+              <w:t>↓ hurts</w:t>
             </w:r>
           </w:p>
         </w:tc>
@@ -1613,7 +1414,7 @@
       <w:tr>
         <w:tc>
           <w:tcPr>
-            <w:tcW w:type="dxa" w:w="1704"/>
+            <w:tcW w:type="dxa" w:w="2045"/>
           </w:tcPr>
           <w:p>
             <w:pPr>
@@ -1632,7 +1433,7 @@
         </w:tc>
         <w:tc>
           <w:tcPr>
-            <w:tcW w:type="dxa" w:w="1704"/>
+            <w:tcW w:type="dxa" w:w="2045"/>
           </w:tcPr>
           <w:p>
             <w:pPr>
@@ -1651,7 +1452,7 @@
         </w:tc>
         <w:tc>
           <w:tcPr>
-            <w:tcW w:type="dxa" w:w="1704"/>
+            <w:tcW w:type="dxa" w:w="2045"/>
           </w:tcPr>
           <w:p>
             <w:pPr>
@@ -1670,7 +1471,7 @@
         </w:tc>
         <w:tc>
           <w:tcPr>
-            <w:tcW w:type="dxa" w:w="1704"/>
+            <w:tcW w:type="dxa" w:w="2045"/>
             <w:shd w:val="clear" w:color="auto" w:fill="FAECEA"/>
           </w:tcPr>
           <w:p>
@@ -1684,13 +1485,13 @@
                 <w:b w:val="0"/>
                 <w:sz w:val="18"/>
               </w:rPr>
-              <w:t>+3 pts</w:t>
+              <w:t>+1</w:t>
             </w:r>
           </w:p>
         </w:tc>
         <w:tc>
           <w:tcPr>
-            <w:tcW w:type="dxa" w:w="1704"/>
+            <w:tcW w:type="dxa" w:w="2045"/>
           </w:tcPr>
           <w:p>
             <w:pPr>
@@ -1703,26 +1504,7 @@
                 <w:b w:val="0"/>
                 <w:sz w:val="18"/>
               </w:rPr>
-              <w:t>+1 bags/20</w:t>
-            </w:r>
-          </w:p>
-        </w:tc>
-        <w:tc>
-          <w:tcPr>
-            <w:tcW w:type="dxa" w:w="1704"/>
-          </w:tcPr>
-          <w:p>
-            <w:pPr>
-              <w:spacing w:after="0" w:before="0"/>
-              <w:jc w:val="center"/>
-            </w:pPr>
-            <w:r/>
-            <w:r>
-              <w:rPr>
-                <w:b w:val="0"/>
-                <w:sz w:val="18"/>
-              </w:rPr>
-              <w:t>↑ raises</w:t>
+              <w:t>↑ helps</w:t>
             </w:r>
           </w:p>
         </w:tc>
@@ -1738,7 +1520,7 @@
           <w:color w:val="666666"/>
           <w:sz w:val="17"/>
         </w:rPr>
-        <w:t>Table 1 — The nine biggest levers. "+17 pts" means a one-step (1-SD) improvement raises the success rate by 17 percentage points — about 3 extra safe steals over a 20-attempt season. Read with Figure 1.</w:t>
+        <w:t>Table 1 — The nine biggest levers, in steals. "Added steals" = the extra stolen bases a runner gains over a 20-attempt season from one realistic improvement in that one skill. Read with Figure 1.</w:t>
       </w:r>
     </w:p>
     <w:p>
@@ -1770,7 +1552,7 @@
         <w:rPr>
           <w:sz w:val="19"/>
         </w:rPr>
-        <w:t>We combined the skills above — jump, first-step burst, and steals-above-what-speed-predicts — into one 'Slow-Steal Skill' score, tuned on 80% of the league with the benchmark names (Naylor, Soto) held out, then ranked every runner-season.</w:t>
+        <w:t>We combined the skills above into one 'Slow-Steal Skill' score, tuned on 80% of the league with the benchmarks (Naylor, Soto) held out, then ranked every runner-season. Two columns are speed-adjusted — Ground Gained and Steals Above Speed-Expected — explained just below.</w:t>
       </w:r>
     </w:p>
     <w:p>
@@ -1790,7 +1572,7 @@
           <w:b/>
           <w:sz w:val="20"/>
         </w:rPr>
-        <w:t>The leaderboard is full of mid-pack-speed runners grading out elite on skill — proof the trait is widespread and findable, not a one-player quirk.</w:t>
+        <w:t>The leaderboard is full of mid-pack-speed runners grading out elite — proof the trait is widespread and findable, not a one-player quirk.</w:t>
       </w:r>
     </w:p>
     <w:p>
@@ -1877,13 +1659,13 @@
           <w:b/>
           <w:sz w:val="17"/>
         </w:rPr>
-        <w:t xml:space="preserve">First-Step Burst — </w:t>
+        <w:t xml:space="preserve">Ground Gained — </w:t>
       </w:r>
       <w:r>
         <w:rPr>
           <w:sz w:val="17"/>
         </w:rPr>
-        <w:t>Reaches top speed in fewer feet than his speed predicts (premium when fast).</w:t>
+        <w:t>Feet of ground covered after the pitcher commits (first move → release). The biggest single driver of a steal.</w:t>
       </w:r>
     </w:p>
     <w:p>
@@ -1903,7 +1685,7 @@
         <w:rPr>
           <w:sz w:val="17"/>
         </w:rPr>
-        <w:t>Real success rate minus what sprint speed alone predicts (pct pts).</w:t>
+        <w:t>How far the runner's success rate sits ABOVE the line speed alone predicts. Positive = beats his speed peers.</w:t>
       </w:r>
     </w:p>
     <w:p>
@@ -1944,6 +1726,117 @@
           <w:sz w:val="17"/>
         </w:rPr>
         <w:t>Overall technique score — skill beyond raw speed. Higher = better.</w:t>
+      </w:r>
+    </w:p>
+    <w:tbl>
+      <w:tblPr>
+        <w:tblStyle w:val="TableGrid"/>
+        <w:tblW w:type="auto" w:w="0"/>
+        <w:jc w:val="center"/>
+        <w:tblLook w:firstColumn="1" w:firstRow="1" w:lastColumn="0" w:lastRow="0" w:noHBand="0" w:noVBand="1" w:val="04A0"/>
+      </w:tblPr>
+      <w:tblGrid>
+        <w:gridCol w:w="10224"/>
+      </w:tblGrid>
+      <w:tr>
+        <w:tc>
+          <w:tcPr>
+            <w:tcW w:type="dxa" w:w="10080"/>
+            <w:shd w:val="clear" w:color="auto" w:fill="2C3E50"/>
+          </w:tcPr>
+          <w:p>
+            <w:pPr>
+              <w:spacing w:after="0" w:before="0"/>
+              <w:jc w:val="left"/>
+            </w:pPr>
+            <w:r/>
+            <w:r>
+              <w:rPr>
+                <w:b/>
+                <w:color w:val="FFFFFF"/>
+                <w:sz w:val="21"/>
+              </w:rPr>
+              <w:t>HOW WE STRIP SPEED OUT (so only skill is left)</w:t>
+            </w:r>
+          </w:p>
+        </w:tc>
+      </w:tr>
+      <w:tr>
+        <w:tc>
+          <w:tcPr>
+            <w:tcW w:type="dxa" w:w="10080"/>
+            <w:shd w:val="clear" w:color="auto" w:fill="F2F7FB"/>
+          </w:tcPr>
+          <w:p>
+            <w:pPr>
+              <w:spacing w:after="40"/>
+            </w:pPr>
+            <w:r/>
+            <w:r>
+              <w:rPr>
+                <w:sz w:val="19"/>
+              </w:rPr>
+              <w:t>Faster runners cover more ground and steal more — of course. To isolate skill we remove what speed alone explains: plot the skill against sprint speed, draw the line speed predicts, and keep only how far each runner sits ABOVE that line. "Ground Gained" and "Steals Above Speed-Expected" are that gap above the line — skill with speed stripped out.</w:t>
+            </w:r>
+          </w:p>
+        </w:tc>
+      </w:tr>
+    </w:tbl>
+    <w:p>
+      <w:pPr>
+        <w:spacing w:after="40"/>
+      </w:pPr>
+    </w:p>
+    <w:p>
+      <w:pPr>
+        <w:jc w:val="center"/>
+      </w:pPr>
+      <w:r>
+        <w:drawing>
+          <wp:inline xmlns:a="http://schemas.openxmlformats.org/drawingml/2006/main" xmlns:pic="http://schemas.openxmlformats.org/drawingml/2006/picture">
+            <wp:extent cx="5212080" cy="3648456"/>
+            <wp:docPr id="2" name="Picture 2"/>
+            <wp:cNvGraphicFramePr>
+              <a:graphicFrameLocks noChangeAspect="1"/>
+            </wp:cNvGraphicFramePr>
+            <a:graphic>
+              <a:graphicData uri="http://schemas.openxmlformats.org/drawingml/2006/picture">
+                <pic:pic>
+                  <pic:nvPicPr>
+                    <pic:cNvPr id="0" name="Fig_GroundCovered_Scatter.png"/>
+                    <pic:cNvPicPr/>
+                  </pic:nvPicPr>
+                  <pic:blipFill>
+                    <a:blip r:embed="rId10"/>
+                    <a:stretch>
+                      <a:fillRect/>
+                    </a:stretch>
+                  </pic:blipFill>
+                  <pic:spPr>
+                    <a:xfrm>
+                      <a:off x="0" y="0"/>
+                      <a:ext cx="5212080" cy="3648456"/>
+                    </a:xfrm>
+                    <a:prstGeom prst="rect"/>
+                  </pic:spPr>
+                </pic:pic>
+              </a:graphicData>
+            </a:graphic>
+          </wp:inline>
+        </w:drawing>
+      </w:r>
+    </w:p>
+    <w:p>
+      <w:pPr>
+        <w:jc w:val="center"/>
+      </w:pPr>
+      <w:r>
+        <w:rPr>
+          <w:i/>
+          <w:color w:val="666666"/>
+          <w:sz w:val="17"/>
+        </w:rPr>
+        <w:t>Figure 2 — Ground covered vs sprint speed. The line is what speed alone predicts; skill is the distance above it. Naylor, Soto, and McMahon sit far above the line at the slowest speeds — elite ground without elite wheels.</w:t>
       </w:r>
     </w:p>
     <w:p>
@@ -2164,9 +2057,9 @@
                 <w:b/>
                 <w:sz w:val="17"/>
               </w:rPr>
-              <w:t>First-Step</w:t>
+              <w:t>Ground Gained</w:t>
               <w:br/>
-              <w:t>Burst</w:t>
+              <w:t>(ft)</w:t>
             </w:r>
           </w:p>
         </w:tc>
@@ -2351,7 +2244,7 @@
         <w:tc>
           <w:tcPr>
             <w:tcW w:type="dxa" w:w="1136"/>
-            <w:shd w:val="clear" w:color="auto" w:fill="8ECC9A"/>
+            <w:shd w:val="clear" w:color="auto" w:fill="D65A4D"/>
           </w:tcPr>
           <w:p>
             <w:pPr>
@@ -2364,7 +2257,7 @@
                 <w:b/>
                 <w:sz w:val="18"/>
               </w:rPr>
-              <w:t>+7.6</w:t>
+              <w:t>41.5</w:t>
             </w:r>
           </w:p>
         </w:tc>
@@ -2533,7 +2426,7 @@
         <w:tc>
           <w:tcPr>
             <w:tcW w:type="dxa" w:w="1136"/>
-            <w:shd w:val="clear" w:color="auto" w:fill="86C993"/>
+            <w:shd w:val="clear" w:color="auto" w:fill="E08278"/>
           </w:tcPr>
           <w:p>
             <w:pPr>
@@ -2546,7 +2439,7 @@
                 <w:b/>
                 <w:sz w:val="18"/>
               </w:rPr>
-              <w:t>+8.0</w:t>
+              <w:t>43.0</w:t>
             </w:r>
           </w:p>
         </w:tc>
@@ -2711,7 +2604,7 @@
         <w:tc>
           <w:tcPr>
             <w:tcW w:type="dxa" w:w="1136"/>
-            <w:shd w:val="clear" w:color="auto" w:fill="E8A49D"/>
+            <w:shd w:val="clear" w:color="auto" w:fill="B5DEBD"/>
           </w:tcPr>
           <w:p>
             <w:pPr>
@@ -2724,7 +2617,7 @@
                 <w:b w:val="0"/>
                 <w:sz w:val="18"/>
               </w:rPr>
-              <w:t>-4.4</w:t>
+              <w:t>46.8</w:t>
             </w:r>
           </w:p>
         </w:tc>
@@ -2888,7 +2781,7 @@
         <w:tc>
           <w:tcPr>
             <w:tcW w:type="dxa" w:w="1136"/>
-            <w:shd w:val="clear" w:color="auto" w:fill="C7E6CD"/>
+            <w:shd w:val="clear" w:color="auto" w:fill="D75E52"/>
           </w:tcPr>
           <w:p>
             <w:pPr>
@@ -2901,7 +2794,7 @@
                 <w:b w:val="0"/>
                 <w:sz w:val="18"/>
               </w:rPr>
-              <w:t>+4.4</w:t>
+              <w:t>42.3</w:t>
             </w:r>
           </w:p>
         </w:tc>
@@ -3069,7 +2962,7 @@
         <w:tc>
           <w:tcPr>
             <w:tcW w:type="dxa" w:w="1136"/>
-            <w:shd w:val="clear" w:color="auto" w:fill="FCF5F4"/>
+            <w:shd w:val="clear" w:color="auto" w:fill="D3EBD8"/>
           </w:tcPr>
           <w:p>
             <w:pPr>
@@ -3082,7 +2975,7 @@
                 <w:b/>
                 <w:sz w:val="18"/>
               </w:rPr>
-              <w:t>+0.6</w:t>
+              <w:t>46.2</w:t>
             </w:r>
           </w:p>
         </w:tc>
@@ -3247,7 +3140,7 @@
         <w:tc>
           <w:tcPr>
             <w:tcW w:type="dxa" w:w="1136"/>
-            <w:shd w:val="clear" w:color="auto" w:fill="FDF8F8"/>
+            <w:shd w:val="clear" w:color="auto" w:fill="AAD9B3"/>
           </w:tcPr>
           <w:p>
             <w:pPr>
@@ -3260,7 +3153,7 @@
                 <w:b w:val="0"/>
                 <w:sz w:val="18"/>
               </w:rPr>
-              <w:t>+0.8</w:t>
+              <w:t>47.0</w:t>
             </w:r>
           </w:p>
         </w:tc>
@@ -3424,7 +3317,7 @@
         <w:tc>
           <w:tcPr>
             <w:tcW w:type="dxa" w:w="1136"/>
-            <w:shd w:val="clear" w:color="auto" w:fill="5AB56B"/>
+            <w:shd w:val="clear" w:color="auto" w:fill="F3D1CD"/>
           </w:tcPr>
           <w:p>
             <w:pPr>
@@ -3437,7 +3330,7 @@
                 <w:b w:val="0"/>
                 <w:sz w:val="18"/>
               </w:rPr>
-              <w:t>+10.6</w:t>
+              <w:t>44.5</w:t>
             </w:r>
           </w:p>
         </w:tc>
@@ -3601,7 +3494,7 @@
         <w:tc>
           <w:tcPr>
             <w:tcW w:type="dxa" w:w="1136"/>
-            <w:shd w:val="clear" w:color="auto" w:fill="AAD9B3"/>
+            <w:shd w:val="clear" w:color="auto" w:fill="AEDAB6"/>
           </w:tcPr>
           <w:p>
             <w:pPr>
@@ -3614,7 +3507,7 @@
                 <w:b w:val="0"/>
                 <w:sz w:val="18"/>
               </w:rPr>
-              <w:t>+6.0</w:t>
+              <w:t>46.9</w:t>
             </w:r>
           </w:p>
         </w:tc>
@@ -3778,7 +3671,7 @@
         <w:tc>
           <w:tcPr>
             <w:tcW w:type="dxa" w:w="1136"/>
-            <w:shd w:val="clear" w:color="auto" w:fill="FCF5F4"/>
+            <w:shd w:val="clear" w:color="auto" w:fill="E2F2E5"/>
           </w:tcPr>
           <w:p>
             <w:pPr>
@@ -3791,7 +3684,7 @@
                 <w:b w:val="0"/>
                 <w:sz w:val="18"/>
               </w:rPr>
-              <w:t>+0.6</w:t>
+              <w:t>46.0</w:t>
             </w:r>
           </w:p>
         </w:tc>
@@ -3955,7 +3848,7 @@
         <w:tc>
           <w:tcPr>
             <w:tcW w:type="dxa" w:w="1136"/>
-            <w:shd w:val="clear" w:color="auto" w:fill="E69A92"/>
+            <w:shd w:val="clear" w:color="auto" w:fill="F6FBF7"/>
           </w:tcPr>
           <w:p>
             <w:pPr>
@@ -3968,7 +3861,7 @@
                 <w:b w:val="0"/>
                 <w:sz w:val="18"/>
               </w:rPr>
-              <w:t>-5.0</w:t>
+              <w:t>45.6</w:t>
             </w:r>
           </w:p>
         </w:tc>
@@ -4132,7 +4025,7 @@
         <w:tc>
           <w:tcPr>
             <w:tcW w:type="dxa" w:w="1136"/>
-            <w:shd w:val="clear" w:color="auto" w:fill="E8A49D"/>
+            <w:shd w:val="clear" w:color="auto" w:fill="B4DDBC"/>
           </w:tcPr>
           <w:p>
             <w:pPr>
@@ -4145,7 +4038,7 @@
                 <w:b w:val="0"/>
                 <w:sz w:val="18"/>
               </w:rPr>
-              <w:t>-4.4</w:t>
+              <w:t>46.8</w:t>
             </w:r>
           </w:p>
         </w:tc>
@@ -4309,7 +4202,7 @@
         <w:tc>
           <w:tcPr>
             <w:tcW w:type="dxa" w:w="1136"/>
-            <w:shd w:val="clear" w:color="auto" w:fill="D65A4D"/>
+            <w:shd w:val="clear" w:color="auto" w:fill="F3D1CD"/>
           </w:tcPr>
           <w:p>
             <w:pPr>
@@ -4322,7 +4215,7 @@
                 <w:b w:val="0"/>
                 <w:sz w:val="18"/>
               </w:rPr>
-              <w:t>-9.4</w:t>
+              <w:t>44.5</w:t>
             </w:r>
           </w:p>
         </w:tc>
@@ -4486,7 +4379,7 @@
         <w:tc>
           <w:tcPr>
             <w:tcW w:type="dxa" w:w="1136"/>
-            <w:shd w:val="clear" w:color="auto" w:fill="E69A92"/>
+            <w:shd w:val="clear" w:color="auto" w:fill="EAF5EC"/>
           </w:tcPr>
           <w:p>
             <w:pPr>
@@ -4499,7 +4392,7 @@
                 <w:b w:val="0"/>
                 <w:sz w:val="18"/>
               </w:rPr>
-              <w:t>-5.0</w:t>
+              <w:t>45.8</w:t>
             </w:r>
           </w:p>
         </w:tc>
@@ -4667,7 +4560,7 @@
         <w:tc>
           <w:tcPr>
             <w:tcW w:type="dxa" w:w="1136"/>
-            <w:shd w:val="clear" w:color="auto" w:fill="E8A49D"/>
+            <w:shd w:val="clear" w:color="auto" w:fill="F7E1DF"/>
           </w:tcPr>
           <w:p>
             <w:pPr>
@@ -4680,7 +4573,7 @@
                 <w:b/>
                 <w:sz w:val="18"/>
               </w:rPr>
-              <w:t>-4.4</w:t>
+              <w:t>44.8</w:t>
             </w:r>
           </w:p>
         </w:tc>
@@ -4858,7 +4751,7 @@
                 <w:b w:val="0"/>
                 <w:sz w:val="18"/>
               </w:rPr>
-              <w:t>+12.0</w:t>
+              <w:t>49.8</w:t>
             </w:r>
           </w:p>
         </w:tc>
@@ -4933,7 +4826,103 @@
           <w:color w:val="666666"/>
           <w:sz w:val="17"/>
         </w:rPr>
-        <w:t>Table 2 — Top 15 by Slow-Steal Skill (2015–2026). The Top Speed column is deliberately uncolored: speed is NOT what earns a spot here. Amber rows flag the benchmark names (Naylor, Soto) — the clearest examples of the trait, not the basis of the score (they were held out while the score was tuned).</w:t>
+        <w:t>Table 2 — Top 15 by Slow-Steal Skill (2015–2026). Top Speed is uncolored on purpose: speed is not what earns a spot. Amber rows flag the benchmarks (Naylor, Soto) — examples of the trait, held out while the score was tuned, not the basis of it.</w:t>
+      </w:r>
+    </w:p>
+    <w:p>
+      <w:r>
+        <w:br w:type="page"/>
+      </w:r>
+    </w:p>
+    <w:p>
+      <w:pPr>
+        <w:pStyle w:val="Heading1"/>
+      </w:pPr>
+      <w:r>
+        <w:t>2b  The Full Leaderboard, Season by Season (with teams)</w:t>
+      </w:r>
+    </w:p>
+    <w:p>
+      <w:pPr>
+        <w:spacing w:after="60"/>
+      </w:pPr>
+      <w:r>
+        <w:rPr>
+          <w:b/>
+          <w:color w:val="2C3E50"/>
+          <w:sz w:val="19"/>
+        </w:rPr>
+        <w:t xml:space="preserve">BOTTOM LINE  </w:t>
+      </w:r>
+      <w:r>
+        <w:rPr>
+          <w:b/>
+          <w:sz w:val="20"/>
+        </w:rPr>
+        <w:t>The trait shows up every year and on every kind of team. Ryan McMahon's 2026 (Rockies) is the highest blueprint score in the data — a slow corner infielder out-converting the league's burners.</w:t>
+      </w:r>
+    </w:p>
+    <w:p>
+      <w:pPr>
+        <w:spacing w:after="80"/>
+      </w:pPr>
+      <w:r>
+        <w:rPr>
+          <w:sz w:val="19"/>
+        </w:rPr>
+        <w:t>Blueprint score = the same speed-adjusted steal skill, scored 2023–2026 (higher = more skill beyond speed). Logos show each runner's team.</w:t>
+      </w:r>
+    </w:p>
+    <w:p>
+      <w:pPr>
+        <w:jc w:val="center"/>
+      </w:pPr>
+      <w:r>
+        <w:drawing>
+          <wp:inline xmlns:a="http://schemas.openxmlformats.org/drawingml/2006/main" xmlns:pic="http://schemas.openxmlformats.org/drawingml/2006/picture">
+            <wp:extent cx="6766560" cy="3542091"/>
+            <wp:docPr id="3" name="Picture 3"/>
+            <wp:cNvGraphicFramePr>
+              <a:graphicFrameLocks noChangeAspect="1"/>
+            </wp:cNvGraphicFramePr>
+            <a:graphic>
+              <a:graphicData uri="http://schemas.openxmlformats.org/drawingml/2006/picture">
+                <pic:pic>
+                  <pic:nvPicPr>
+                    <pic:cNvPr id="0" name="Fig_BCS_Top25_ByYear.png"/>
+                    <pic:cNvPicPr/>
+                  </pic:nvPicPr>
+                  <pic:blipFill>
+                    <a:blip r:embed="rId11"/>
+                    <a:stretch>
+                      <a:fillRect/>
+                    </a:stretch>
+                  </pic:blipFill>
+                  <pic:spPr>
+                    <a:xfrm>
+                      <a:off x="0" y="0"/>
+                      <a:ext cx="6766560" cy="3542091"/>
+                    </a:xfrm>
+                    <a:prstGeom prst="rect"/>
+                  </pic:spPr>
+                </pic:pic>
+              </a:graphicData>
+            </a:graphic>
+          </wp:inline>
+        </w:drawing>
+      </w:r>
+    </w:p>
+    <w:p>
+      <w:pPr>
+        <w:jc w:val="center"/>
+      </w:pPr>
+      <w:r>
+        <w:rPr>
+          <w:i/>
+          <w:color w:val="666666"/>
+          <w:sz w:val="17"/>
+        </w:rPr>
+        <w:t>Figure 3 — Top 25 blueprint scores per season, 2023–2026 (2026 partial). Bars are speed-adjusted steal skill; gold = the slow-but-elite archetype, red = Naylor, green = Soto. Team logos mark each runner's club.</w:t>
       </w:r>
     </w:p>
     <w:p>
@@ -5069,7 +5058,7 @@
         <w:drawing>
           <wp:inline xmlns:a="http://schemas.openxmlformats.org/drawingml/2006/main" xmlns:pic="http://schemas.openxmlformats.org/drawingml/2006/picture">
             <wp:extent cx="6035040" cy="4041894"/>
-            <wp:docPr id="2" name="Picture 2"/>
+            <wp:docPr id="4" name="Picture 4"/>
             <wp:cNvGraphicFramePr>
               <a:graphicFrameLocks noChangeAspect="1"/>
             </wp:cNvGraphicFramePr>
@@ -5081,7 +5070,7 @@
                     <pic:cNvPicPr/>
                   </pic:nvPicPr>
                   <pic:blipFill>
-                    <a:blip r:embed="rId10"/>
+                    <a:blip r:embed="rId12"/>
                     <a:stretch>
                       <a:fillRect/>
                     </a:stretch>
@@ -5110,7 +5099,7 @@
           <w:color w:val="666666"/>
           <w:sz w:val="17"/>
         </w:rPr>
-        <w:t>Figure 2 — Each dot is a runner-season (2023–2026). X-axis = top speed in standard deviations (right = faster); Y-axis = steal production (up = more). Green = fast &amp; productive; blue (lower-right) = fast but under-stealing (the green-light targets); gold = the slow-but-productive archetype (★ Naylor, Soto); grey = neither. No red — no quadrant here is 'bad'.</w:t>
+        <w:t>Figure 4 — Each dot is a runner-season (2023–2026). X-axis = top speed in standard deviations (right = faster); Y-axis = steal production (up = more). Green = fast &amp; productive; blue (lower-right) = fast but under-stealing (the green-light targets); gold = the slow-but-productive archetype (★ Naylor, Soto); grey = neither. No red — no quadrant here is 'bad'.</w:t>
       </w:r>
     </w:p>
     <w:p>
@@ -5137,7 +5126,7 @@
         <w:rPr>
           <w:sz w:val="19"/>
         </w:rPr>
-        <w:t>We isolated the 2025 runners with top-third speed who already succeed at 80%+ but attempt fewer than ~20 steals, and projected the bags they'd add at a modest, speed-appropriate volume — kept at their own proven success rate.</w:t>
+        <w:t>We isolated the 2025 runners with top-third speed who already succeed at 80%+ but attempt fewer than ~20 steals, and projected the extra steals they'd add at a modest, speed-appropriate volume — kept at their own proven success rate.</w:t>
       </w:r>
     </w:p>
     <w:p>
@@ -5537,7 +5526,7 @@
               </w:rPr>
               <w:t>If unleashed</w:t>
               <w:br/>
-              <w:t>(+ bags)</w:t>
+              <w:t>(+ steals)</w:t>
             </w:r>
           </w:p>
         </w:tc>
@@ -7021,9 +7010,9 @@
                 <w:b/>
                 <w:sz w:val="17"/>
               </w:rPr>
-              <w:t>Fix → success</w:t>
+              <w:t>Fix →</w:t>
               <w:br/>
-              <w:t>gain</w:t>
+              <w:t>+ steals/20</w:t>
             </w:r>
           </w:p>
         </w:tc>
@@ -7159,7 +7148,7 @@
                 <w:b w:val="0"/>
                 <w:sz w:val="18"/>
               </w:rPr>
-              <w:t>+1 pts</w:t>
+              <w:t>—</w:t>
             </w:r>
           </w:p>
         </w:tc>
@@ -7295,7 +7284,7 @@
                 <w:b w:val="0"/>
                 <w:sz w:val="18"/>
               </w:rPr>
-              <w:t>+23 pts</w:t>
+              <w:t>+5</w:t>
             </w:r>
           </w:p>
         </w:tc>
@@ -7431,7 +7420,7 @@
                 <w:b w:val="0"/>
                 <w:sz w:val="18"/>
               </w:rPr>
-              <w:t>+3 pts</w:t>
+              <w:t>+1</w:t>
             </w:r>
           </w:p>
         </w:tc>
@@ -7567,7 +7556,7 @@
                 <w:b w:val="0"/>
                 <w:sz w:val="18"/>
               </w:rPr>
-              <w:t>+16 pts</w:t>
+              <w:t>+3</w:t>
             </w:r>
           </w:p>
         </w:tc>
@@ -7703,7 +7692,7 @@
                 <w:b w:val="0"/>
                 <w:sz w:val="18"/>
               </w:rPr>
-              <w:t>+4 pts</w:t>
+              <w:t>+1</w:t>
             </w:r>
           </w:p>
         </w:tc>
@@ -7839,7 +7828,7 @@
                 <w:b w:val="0"/>
                 <w:sz w:val="18"/>
               </w:rPr>
-              <w:t>+33 pts</w:t>
+              <w:t>+7</w:t>
             </w:r>
           </w:p>
         </w:tc>
@@ -7855,7 +7844,7 @@
           <w:color w:val="666666"/>
           <w:sz w:val="17"/>
         </w:rPr>
-        <w:t>Table 4 — 2025 technique-fix board. "Fix → success gain" = projected percentage-point gain if the weakest lever is raised to league average (via the Table-1 weights); higher success rate = redder here is worse, greener is better.</w:t>
+        <w:t>Table 4 — 2025 technique-fix board. "Fix → + steals/20" = the extra steals a runner would gain over 20 tries if his weakest skill were raised to league average. Red success rate = caught too often today; that's the opportunity.</w:t>
       </w:r>
     </w:p>
     <w:p>
@@ -7879,7 +7868,7 @@
         <w:rPr>
           <w:sz w:val="20"/>
         </w:rPr>
-        <w:t>The equation in Section 1 points to three trainable levers. Each is technique, not body type — which is why a slow runner can lead the league in steal skill. The payoff below is straight off Table 1.</w:t>
+        <w:t>Section 1 names three trainable skills. Each is technique, not body type — which is why a slow runner can lead the league in steal skill. The payoff below is straight off Table 1.</w:t>
       </w:r>
     </w:p>
     <w:p>
@@ -7892,7 +7881,7 @@
           <w:b/>
           <w:sz w:val="20"/>
         </w:rPr>
-        <w:t xml:space="preserve">Cover more ground once the pitcher commits.  (+25 pts ≈ +5 bags / 20 tries)  </w:t>
+        <w:t xml:space="preserve">Cover more ground once the pitcher commits.  (+5 steals / 20 tries)  </w:t>
       </w:r>
       <w:r>
         <w:rPr>
@@ -7911,7 +7900,7 @@
           <w:b/>
           <w:sz w:val="20"/>
         </w:rPr>
-        <w:t xml:space="preserve">Sharpen the jump.  (+17 pts ≈ +3 bags / 20 tries)  </w:t>
+        <w:t xml:space="preserve">Sharpen the jump.  (+3 steals / 20 tries)  </w:t>
       </w:r>
       <w:r>
         <w:rPr>
@@ -7930,7 +7919,7 @@
           <w:b/>
           <w:sz w:val="20"/>
         </w:rPr>
-        <w:t xml:space="preserve">Reach top speed sooner — first-step burst.  (+10 pts ≈ +2 bags / 20 tries)  </w:t>
+        <w:t xml:space="preserve">Reach top speed sooner.  (+2 steals / 20 tries)  </w:t>
       </w:r>
       <w:r>
         <w:rPr>
@@ -7974,7 +7963,7 @@
         <w:rPr>
           <w:sz w:val="19"/>
         </w:rPr>
-        <w:t>"If unleashed" holds a runner at his own 2025 success rate and a modest ~20-attempt volume; real results depend on health, matchups, and game situation. Treat the bag counts as a priority ranking, not a guarantee.</w:t>
+        <w:t>"If unleashed" holds a runner at his own 2025 success rate and a modest ~20-attempt volume; real results depend on health, matchups, and game situation. Treat the steal projections as a priority ranking — not a guarantee.</w:t>
       </w:r>
     </w:p>
     <w:p>

</xml_diff>